<commit_message>
Add selective planner updates and document existing-notebook upgrades
</commit_message>
<xml_diff>
--- a/output/docx/교무수첩_사용안내서.docx
+++ b/output/docx/교무수첩_사용안내서.docx
@@ -20,7 +20,7 @@
     </w:p>
     <w:p>
       <w:r>
-        <w:t>2026년 10월 1일 기준  ·  문서 버전 1.0  ·  교사용</w:t>
+        <w:t>2026년 10월 1일 기준  ·  문서 버전 1.1  ·  교사용</w:t>
       </w:r>
     </w:p>
     <w:p>
@@ -390,7 +390,7 @@
       <w:r>
         <w:t>빠른 찾기  2쪽 일과와 할 일  ·  3쪽 학생과 상담  ·  4쪽 시간표와 진도</w:t>
         <w:br/>
-        <w:t>5쪽 기록 양식  ·  6쪽 급식과 학사일정  ·  7쪽 주간 정리  ·  8쪽 문제 해결</w:t>
+        <w:t>5쪽 기록 양식  ·  6쪽 급식과 학사일정  ·  7쪽 주간 정리  ·  8쪽 문제 해결  ·  9쪽 기존 수첩 업데이트</w:t>
       </w:r>
     </w:p>
     <w:p>
@@ -2849,7 +2849,461 @@
     </w:p>
     <w:p>
       <w:r>
-        <w:t>기능 기준  저장소 1db3162 및 2026년 10월 1일 예시 수첩 반영 내용. 화면 위치와 메뉴 이름은 Notion 언어·보기 설정에 따라 조금 다를 수 있습니다.</w:t>
+        <w:t>기능 기준  2026년 10월 1일 예시 수첩과 업데이트 목록 2026.10.1. 화면 위치와 메뉴 이름은 Notion 언어·보기 설정에 따라 조금 다를 수 있습니다.</w:t>
+      </w:r>
+    </w:p>
+    <w:p>
+      <w:pPr>
+        <w:pStyle w:val="Heading1"/>
+        <w:pageBreakBefore/>
+      </w:pPr>
+      <w:r>
+        <w:t>8  기존 수첩에 새 기능 적용하기</w:t>
+      </w:r>
+    </w:p>
+    <w:p>
+      <w:r>
+        <w:t>새 기능은 홈의 ‘업데이트 확인’에서 선택해 적용합니다. 이미 만든 수첩의 학생 기록과 직접 꾸민 페이지는 유지합니다.</w:t>
+      </w:r>
+    </w:p>
+    <w:p>
+      <w:pPr>
+        <w:pStyle w:val="Heading2"/>
+      </w:pPr>
+      <w:r>
+        <w:t>처음 사용하는 기존 수첩이라면</w:t>
+      </w:r>
+    </w:p>
+    <w:p>
+      <w:r>
+        <w:t>AI가 기존 설치 기록에서 데이터베이스 위치를 확인하고 홈에 업데이트 링크를 추가합니다. 학교 정보나 API 키를 다시 적지 않습니다. 클라우드 미연결 수첩은 AI와 직접 적용하고 설치 기록에 이력을 남깁니다.</w:t>
+      </w:r>
+    </w:p>
+    <w:p>
+      <w:r>
+        <w:t>“기존 교무수첩에 docs/UPDATES.md의 업데이트 경로를 연결해 줘. 기록과 화면을 보존하고, 학생별 상담 이력 연결부터 적용 상태를 확인해 줘.”</w:t>
+      </w:r>
+    </w:p>
+    <w:p>
+      <w:pPr>
+        <w:pStyle w:val="Heading2"/>
+      </w:pPr>
+      <w:r>
+        <w:t>업데이트 적용 순서</w:t>
+      </w:r>
+    </w:p>
+    <w:p>
+      <w:r>
+        <w:rPr>
+          <w:b/>
+        </w:rPr>
+        <w:t xml:space="preserve">1. 업데이트 확인 열기  </w:t>
+      </w:r>
+      <w:r>
+        <w:t>홈의 링크를 엽니다. 연결이 만료되었다면 Notion에서 같은 수첩을 다시 허용합니다.</w:t>
+      </w:r>
+    </w:p>
+    <w:p>
+      <w:r>
+        <w:rPr>
+          <w:b/>
+        </w:rPr>
+        <w:t xml:space="preserve">2. 변경 내용 읽고 선택하기  </w:t>
+      </w:r>
+      <w:r>
+        <w:t>‘학생별 상담 이력 연결 · 2026.10.1’을 확인하고 ‘이 업데이트 적용’을 누릅니다. 적용 중에는 관련 DB 편집을 잠시 멈춥니다.</w:t>
+      </w:r>
+    </w:p>
+    <w:p>
+      <w:r>
+        <w:rPr>
+          <w:b/>
+        </w:rPr>
+        <w:t xml:space="preserve">3. 남은 화면 설정 확인하기  </w:t>
+      </w:r>
+      <w:r>
+        <w:t>학생 창에 해당 학생의 지난 상담이 모이고 상담일 내림차순인지 확인합니다. 목록이 없거나 다르면 AI에게 공통 레이아웃 설정을 요청합니다.</w:t>
+      </w:r>
+    </w:p>
+    <w:p>
+      <w:r>
+        <w:rPr>
+          <w:b/>
+        </w:rPr>
+        <w:t xml:space="preserve">4. 확인 완료 남기기  </w:t>
+      </w:r>
+      <w:r>
+        <w:t>목록과 정렬을 확인한 뒤 체크하고 ‘화면 확인 완료 기록’을 누릅니다. 이 화면 확인은 사용자가 확인했다는 기록입니다.</w:t>
+      </w:r>
+    </w:p>
+    <w:tbl>
+      <w:tblPr>
+        <w:tblW w:type="auto" w:w="0"/>
+        <w:jc w:val="center"/>
+        <w:tblLayout w:type="fixed"/>
+        <w:tblLook w:firstColumn="1" w:firstRow="1" w:lastColumn="0" w:lastRow="0" w:noHBand="0" w:noVBand="1" w:val="04A0"/>
+        <w:tblBorders>
+          <w:top w:val="single" w:sz="4" w:color="D9D9D9"/>
+          <w:left w:val="single" w:sz="4" w:color="D9D9D9"/>
+          <w:bottom w:val="single" w:sz="4" w:color="D9D9D9"/>
+          <w:right w:val="single" w:sz="4" w:color="D9D9D9"/>
+          <w:insideH w:val="single" w:sz="4" w:color="D9D9D9"/>
+          <w:insideV w:val="single" w:sz="4" w:color="D9D9D9"/>
+        </w:tblBorders>
+      </w:tblPr>
+      <w:tblGrid>
+        <w:gridCol w:w="3672"/>
+        <w:gridCol w:w="6408"/>
+      </w:tblGrid>
+      <w:tr>
+        <w:trPr>
+          <w:cantSplit/>
+          <w:tblHeader/>
+        </w:trPr>
+        <w:tc>
+          <w:tcPr>
+            <w:tcW w:type="dxa" w:w="3672"/>
+            <w:vAlign w:val="center"/>
+            <w:tcMar>
+              <w:top w:w="105" w:type="dxa"/>
+              <w:left w:w="105" w:type="dxa"/>
+              <w:bottom w:w="105" w:type="dxa"/>
+              <w:right w:w="105" w:type="dxa"/>
+            </w:tcMar>
+            <w:shd w:fill="E9EEF2"/>
+          </w:tcPr>
+          <w:p>
+            <w:pPr>
+              <w:keepNext w:val="0"/>
+              <w:spacing w:after="0" w:line="290" w:lineRule="exact"/>
+            </w:pPr>
+            <w:r>
+              <w:rPr>
+                <w:b/>
+                <w:sz w:val="21"/>
+              </w:rPr>
+              <w:t>표시 상태</w:t>
+            </w:r>
+          </w:p>
+        </w:tc>
+        <w:tc>
+          <w:tcPr>
+            <w:tcW w:type="dxa" w:w="6408"/>
+            <w:vAlign w:val="center"/>
+            <w:tcMar>
+              <w:top w:w="105" w:type="dxa"/>
+              <w:left w:w="105" w:type="dxa"/>
+              <w:bottom w:w="105" w:type="dxa"/>
+              <w:right w:w="105" w:type="dxa"/>
+            </w:tcMar>
+            <w:shd w:fill="E9EEF2"/>
+          </w:tcPr>
+          <w:p>
+            <w:pPr>
+              <w:spacing w:after="0" w:line="290" w:lineRule="exact"/>
+            </w:pPr>
+            <w:r>
+              <w:rPr>
+                <w:b/>
+                <w:sz w:val="21"/>
+              </w:rPr>
+              <w:t>이때 할 일</w:t>
+            </w:r>
+          </w:p>
+        </w:tc>
+      </w:tr>
+      <w:tr>
+        <w:trPr>
+          <w:cantSplit/>
+        </w:trPr>
+        <w:tc>
+          <w:tcPr>
+            <w:tcW w:type="dxa" w:w="3672"/>
+            <w:vAlign w:val="center"/>
+            <w:tcMar>
+              <w:top w:w="105" w:type="dxa"/>
+              <w:left w:w="105" w:type="dxa"/>
+              <w:bottom w:w="105" w:type="dxa"/>
+              <w:right w:w="105" w:type="dxa"/>
+            </w:tcMar>
+          </w:tcPr>
+          <w:p>
+            <w:pPr>
+              <w:keepNext w:val="0"/>
+              <w:spacing w:after="0" w:line="290" w:lineRule="exact"/>
+            </w:pPr>
+            <w:r>
+              <w:rPr>
+                <w:b w:val="0"/>
+                <w:sz w:val="21"/>
+              </w:rPr>
+              <w:t>미적용</w:t>
+            </w:r>
+          </w:p>
+        </w:tc>
+        <w:tc>
+          <w:tcPr>
+            <w:tcW w:type="dxa" w:w="6408"/>
+            <w:vAlign w:val="center"/>
+            <w:tcMar>
+              <w:top w:w="105" w:type="dxa"/>
+              <w:left w:w="105" w:type="dxa"/>
+              <w:bottom w:w="105" w:type="dxa"/>
+              <w:right w:w="105" w:type="dxa"/>
+            </w:tcMar>
+          </w:tcPr>
+          <w:p>
+            <w:pPr>
+              <w:spacing w:after="0" w:line="290" w:lineRule="exact"/>
+            </w:pPr>
+            <w:r>
+              <w:rPr>
+                <w:b w:val="0"/>
+                <w:sz w:val="21"/>
+              </w:rPr>
+              <w:t>변경 내용을 읽고 필요한 항목만 선택합니다.</w:t>
+            </w:r>
+          </w:p>
+        </w:tc>
+      </w:tr>
+      <w:tr>
+        <w:trPr>
+          <w:cantSplit/>
+        </w:trPr>
+        <w:tc>
+          <w:tcPr>
+            <w:tcW w:type="dxa" w:w="3672"/>
+            <w:vAlign w:val="center"/>
+            <w:tcMar>
+              <w:top w:w="105" w:type="dxa"/>
+              <w:left w:w="105" w:type="dxa"/>
+              <w:bottom w:w="105" w:type="dxa"/>
+              <w:right w:w="105" w:type="dxa"/>
+            </w:tcMar>
+          </w:tcPr>
+          <w:p>
+            <w:pPr>
+              <w:keepNext w:val="0"/>
+              <w:spacing w:after="0" w:line="290" w:lineRule="exact"/>
+            </w:pPr>
+            <w:r>
+              <w:rPr>
+                <w:b w:val="0"/>
+                <w:sz w:val="21"/>
+              </w:rPr>
+              <w:t>진행 중</w:t>
+            </w:r>
+          </w:p>
+        </w:tc>
+        <w:tc>
+          <w:tcPr>
+            <w:tcW w:type="dxa" w:w="6408"/>
+            <w:vAlign w:val="center"/>
+            <w:tcMar>
+              <w:top w:w="105" w:type="dxa"/>
+              <w:left w:w="105" w:type="dxa"/>
+              <w:bottom w:w="105" w:type="dxa"/>
+              <w:right w:w="105" w:type="dxa"/>
+            </w:tcMar>
+          </w:tcPr>
+          <w:p>
+            <w:pPr>
+              <w:spacing w:after="0" w:line="290" w:lineRule="exact"/>
+            </w:pPr>
+            <w:r>
+              <w:rPr>
+                <w:b w:val="0"/>
+                <w:sz w:val="21"/>
+              </w:rPr>
+              <w:t>‘적용 상태 다시 확인’으로 실제 상태를 조회합니다. 전체 설치를 재실행하지 않습니다.</w:t>
+            </w:r>
+          </w:p>
+        </w:tc>
+      </w:tr>
+      <w:tr>
+        <w:trPr>
+          <w:cantSplit/>
+        </w:trPr>
+        <w:tc>
+          <w:tcPr>
+            <w:tcW w:type="dxa" w:w="3672"/>
+            <w:vAlign w:val="center"/>
+            <w:tcMar>
+              <w:top w:w="105" w:type="dxa"/>
+              <w:left w:w="105" w:type="dxa"/>
+              <w:bottom w:w="105" w:type="dxa"/>
+              <w:right w:w="105" w:type="dxa"/>
+            </w:tcMar>
+          </w:tcPr>
+          <w:p>
+            <w:pPr>
+              <w:keepNext w:val="0"/>
+              <w:spacing w:after="0" w:line="290" w:lineRule="exact"/>
+            </w:pPr>
+            <w:r>
+              <w:rPr>
+                <w:b w:val="0"/>
+                <w:sz w:val="21"/>
+              </w:rPr>
+              <w:t>관계 연결 확인 · 화면 설정 대기</w:t>
+            </w:r>
+          </w:p>
+        </w:tc>
+        <w:tc>
+          <w:tcPr>
+            <w:tcW w:type="dxa" w:w="6408"/>
+            <w:vAlign w:val="center"/>
+            <w:tcMar>
+              <w:top w:w="105" w:type="dxa"/>
+              <w:left w:w="105" w:type="dxa"/>
+              <w:bottom w:w="105" w:type="dxa"/>
+              <w:right w:w="105" w:type="dxa"/>
+            </w:tcMar>
+          </w:tcPr>
+          <w:p>
+            <w:pPr>
+              <w:spacing w:after="0" w:line="290" w:lineRule="exact"/>
+            </w:pPr>
+            <w:r>
+              <w:rPr>
+                <w:b w:val="0"/>
+                <w:sz w:val="21"/>
+              </w:rPr>
+              <w:t>학생별 목록과 정렬을 확인한 뒤 완료를 기록합니다.</w:t>
+            </w:r>
+          </w:p>
+        </w:tc>
+      </w:tr>
+      <w:tr>
+        <w:trPr>
+          <w:cantSplit/>
+        </w:trPr>
+        <w:tc>
+          <w:tcPr>
+            <w:tcW w:type="dxa" w:w="3672"/>
+            <w:vAlign w:val="center"/>
+            <w:tcMar>
+              <w:top w:w="105" w:type="dxa"/>
+              <w:left w:w="105" w:type="dxa"/>
+              <w:bottom w:w="105" w:type="dxa"/>
+              <w:right w:w="105" w:type="dxa"/>
+            </w:tcMar>
+          </w:tcPr>
+          <w:p>
+            <w:pPr>
+              <w:keepNext w:val="0"/>
+              <w:spacing w:after="0" w:line="290" w:lineRule="exact"/>
+            </w:pPr>
+            <w:r>
+              <w:rPr>
+                <w:b w:val="0"/>
+                <w:sz w:val="21"/>
+              </w:rPr>
+              <w:t>AI와 확인 필요</w:t>
+            </w:r>
+          </w:p>
+        </w:tc>
+        <w:tc>
+          <w:tcPr>
+            <w:tcW w:type="dxa" w:w="6408"/>
+            <w:vAlign w:val="center"/>
+            <w:tcMar>
+              <w:top w:w="105" w:type="dxa"/>
+              <w:left w:w="105" w:type="dxa"/>
+              <w:bottom w:w="105" w:type="dxa"/>
+              <w:right w:w="105" w:type="dxa"/>
+            </w:tcMar>
+          </w:tcPr>
+          <w:p>
+            <w:pPr>
+              <w:spacing w:after="0" w:line="290" w:lineRule="exact"/>
+            </w:pPr>
+            <w:r>
+              <w:rPr>
+                <w:b w:val="0"/>
+                <w:sz w:val="21"/>
+              </w:rPr>
+              <w:t>기존 상담이나 충돌이 있어 자동 변경을 멈춘 상태입니다. AI 요청문을 복사해 전달합니다.</w:t>
+            </w:r>
+          </w:p>
+        </w:tc>
+      </w:tr>
+      <w:tr>
+        <w:trPr>
+          <w:cantSplit/>
+        </w:trPr>
+        <w:tc>
+          <w:tcPr>
+            <w:tcW w:type="dxa" w:w="3672"/>
+            <w:vAlign w:val="center"/>
+            <w:tcMar>
+              <w:top w:w="105" w:type="dxa"/>
+              <w:left w:w="105" w:type="dxa"/>
+              <w:bottom w:w="105" w:type="dxa"/>
+              <w:right w:w="105" w:type="dxa"/>
+            </w:tcMar>
+          </w:tcPr>
+          <w:p>
+            <w:pPr>
+              <w:keepNext w:val="0"/>
+              <w:spacing w:after="0" w:line="290" w:lineRule="exact"/>
+            </w:pPr>
+            <w:r>
+              <w:rPr>
+                <w:b w:val="0"/>
+                <w:sz w:val="21"/>
+              </w:rPr>
+              <w:t>적용 완료</w:t>
+            </w:r>
+          </w:p>
+        </w:tc>
+        <w:tc>
+          <w:tcPr>
+            <w:tcW w:type="dxa" w:w="6408"/>
+            <w:vAlign w:val="center"/>
+            <w:tcMar>
+              <w:top w:w="105" w:type="dxa"/>
+              <w:left w:w="105" w:type="dxa"/>
+              <w:bottom w:w="105" w:type="dxa"/>
+              <w:right w:w="105" w:type="dxa"/>
+            </w:tcMar>
+          </w:tcPr>
+          <w:p>
+            <w:pPr>
+              <w:spacing w:after="0" w:line="290" w:lineRule="exact"/>
+            </w:pPr>
+            <w:r>
+              <w:rPr>
+                <w:b w:val="0"/>
+                <w:sz w:val="21"/>
+              </w:rPr>
+              <w:t>관계 확인과 사용자 화면 확인이 기록되었습니다. 다시 확인해도 중복 생성하지 않습니다.</w:t>
+            </w:r>
+          </w:p>
+        </w:tc>
+      </w:tr>
+    </w:tbl>
+    <w:p>
+      <w:pPr>
+        <w:spacing w:after="0"/>
+      </w:pPr>
+    </w:p>
+    <w:p>
+      <w:pPr>
+        <w:pStyle w:val="Heading2"/>
+      </w:pPr>
+      <w:r>
+        <w:t>자동 적용 범위와 보존 원칙</w:t>
+      </w:r>
+    </w:p>
+    <w:p>
+      <w:r>
+        <w:t>기존 양방향 관계는 확인만 합니다. 빈 상담 DB만 자동 전환하며, 기존 상담이 있으면 AI가 관계 목록을 보관하고 비교하며 진행합니다. 다른 속성을 덮어쓰지 않으며, 불확실하면 중단합니다.</w:t>
+      </w:r>
+    </w:p>
+    <w:p>
+      <w:r>
+        <w:t>급식·학사일정의 매일 갱신은 별개입니다. 버전은 기능별로 관리하며, 적용 이력에는 위치와 단계만 저장합니다. 학생 이름·상담 본문은 넣지 않습니다.</w:t>
       </w:r>
     </w:p>
     <w:sectPr>

</xml_diff>

<commit_message>
Use one teacher planner per academic year
</commit_message>
<xml_diff>
--- a/output/docx/교무수첩_사용안내서.docx
+++ b/output/docx/교무수첩_사용안내서.docx
@@ -20,12 +20,12 @@
     </w:p>
     <w:p>
       <w:r>
-        <w:t>2026년 10월 1일 기준  ·  문서 버전 1.1  ·  교사용</w:t>
+        <w:t>2026년 10월 1일 기준  ·  문서 버전 1.2  ·  교사용</w:t>
       </w:r>
     </w:p>
     <w:p>
       <w:r>
-        <w:t>이 안내서는 Notion에 만든 교무수첩을 매일 사용하는 방법을 설명합니다. 홈에서 오늘 할 일을 확인하고, 학생·수업·일정 페이지에서 기록을 관리하세요. 같은 원본을 여러 보기에서 사용하므로 한곳에서 수정한 기록이 연결된 화면에도 반영됩니다.</w:t>
+        <w:t>이 안내서는 학년도마다 한 권의 Notion 교무수첩을 사용하는 방법을 설명합니다. 해당 연도 3월부터 다음 해 2월까지 같은 수첩에서 학생·수업·일정 기록을 관리합니다. 같은 원본을 여러 보기에서 사용하므로 한곳에서 수정한 기록이 연결된 화면에도 반영됩니다.</w:t>
       </w:r>
     </w:p>
     <w:p>
@@ -44,7 +44,7 @@
         <w:t xml:space="preserve">1. 홈을 즐겨찾기에 넣기  </w:t>
       </w:r>
       <w:r>
-        <w:t>교무수첩 첫 페이지를 열고 학년도·학기·담당 반을 확인합니다.</w:t>
+        <w:t>교무수첩 첫 페이지를 열고 학년도·담당 반을 확인합니다.</w:t>
       </w:r>
     </w:p>
     <w:p>
@@ -2687,12 +2687,12 @@
     </w:p>
     <w:p>
       <w:r>
-        <w:t>학급과 진도 기록은 새 학기·학년도에 맞춰 시작합니다. 과거 기록의 학년도를 일괄 바꾸면 지난 기록을 찾기 어려워질 수 있습니다. 이전 기록은 보존하고 새 학년도 수첩 또는 새 기록을 준비하세요.</w:t>
+        <w:t>2학기에도 같은 수첩을 이어 쓰며 학생·상담·업무 기록을 보존합니다. 진도의 학기는 필요한 기록에서 선택해 1·2학기 보기로 구분합니다. 제목에 ‘1학기’가 있으면 원할 때 제목만 바꿉니다.</w:t>
       </w:r>
     </w:p>
     <w:p>
       <w:r>
-        <w:t>양식의 학년도 기본값, 캘린더 필터, 학교 연동 대상 학년도를 함께 확인합니다. 학생 이름만으로 새 학생과 기존 상담을 합치지 말고 실제 학생을 확인해 연결합니다. 클라우드 연동도 학년도를 자동 추정해 전환하지 않습니다.</w:t>
+        <w:t>새 학년도에는 이전 수첩을 보존하고 새 수첩을 준비합니다. 양식 기본값·캘린더 필터·학교 연동 학년도를 확인합니다. 과거 학년도를 일괄 바꾸거나 학생 이름만으로 기록을 합치지 않습니다. 클라우드 연동은 학년도를 자동 전환하지 않습니다.</w:t>
       </w:r>
     </w:p>
     <w:p>
@@ -2824,7 +2824,7 @@
     </w:p>
     <w:p>
       <w:r>
-        <w:t>아래 저장소 링크를 자신의 생성형 AI에 전달하고 “START_HERE.md 순서대로 내 Notion에 교무수첩을 만들어줘”라고 요청합니다. 학교급, 학년도·학기, 담당 반·교과, 필요한 기능과 생성할 상위 페이지를 확인합니다. 실제 생성에는 Notion 쓰기 연결 또는 실행 환경이 필요합니다.</w:t>
+        <w:t>아래 저장소 링크를 자신의 생성형 AI에 전달하고 “START_HERE.md 순서대로 내 Notion에 교무수첩을 만들어줘”라고 요청합니다. 학교급, 학년도, 담당 반·교과, 필요한 기능과 생성할 상위 페이지를 확인합니다. 실제 생성에는 Notion 쓰기 연결 또는 실행 환경이 필요합니다.</w:t>
       </w:r>
     </w:p>
     <w:p>

</xml_diff>

<commit_message>
Publish browsable user guide and community introduction
</commit_message>
<xml_diff>
--- a/output/docx/교무수첩_사용안내서.docx
+++ b/output/docx/교무수첩_사용안내서.docx
@@ -20,13 +20,58 @@
     </w:p>
     <w:p>
       <w:r>
-        <w:t>2026년 10월 1일 기준  ·  문서 버전 1.2  ·  교사용</w:t>
+        <w:t>2026년 10월 2일 기준  ·  문서 버전 1.3  ·  교사용</w:t>
       </w:r>
     </w:p>
     <w:p>
       <w:r>
         <w:t>이 안내서는 학년도마다 한 권의 Notion 교무수첩을 사용하는 방법을 설명합니다. 해당 연도 3월부터 다음 해 2월까지 같은 수첩에서 학생·수업·일정 기록을 관리합니다. 같은 원본을 여러 보기에서 사용하므로 한곳에서 수정한 기록이 연결된 화면에도 반영됩니다.</w:t>
       </w:r>
+    </w:p>
+    <w:p>
+      <w:pPr>
+        <w:pStyle w:val="Heading2"/>
+      </w:pPr>
+      <w:r>
+        <w:t>새 수첩은 웹 질문지에서 준비하기</w:t>
+      </w:r>
+    </w:p>
+    <w:p>
+      <w:r>
+        <w:t>5단계 질문지에서 학교·학년도·담당 수업과 필요한 기능을 선택합니다. 완성된 AI 요청문을 복사해 Notion에 페이지를 만들고 수정할 수 있는 AI에 전달하세요. 질문지는 브라우저 안에서 요청문을 만들며, 실제 수첩 생성은 연결된 AI가 진행합니다.</w:t>
+      </w:r>
+    </w:p>
+    <w:p>
+      <w:hyperlink r:id="rId10">
+        <w:r>
+          <w:rPr>
+            <w:color w:val="245A81"/>
+          </w:rPr>
+          <w:t>웹 질문지 열기</w:t>
+        </w:r>
+      </w:hyperlink>
+      <w:r>
+        <w:t xml:space="preserve">  ·  </w:t>
+      </w:r>
+      <w:hyperlink r:id="rId11">
+        <w:r>
+          <w:rPr>
+            <w:color w:val="245A81"/>
+          </w:rPr>
+          <w:t>HTML 안내서 읽기</w:t>
+        </w:r>
+      </w:hyperlink>
+      <w:r>
+        <w:t xml:space="preserve">  ·  </w:t>
+      </w:r>
+      <w:hyperlink r:id="rId12">
+        <w:r>
+          <w:rPr>
+            <w:color w:val="245A81"/>
+          </w:rPr>
+          <w:t>PDF 안내서 열기</w:t>
+        </w:r>
+      </w:hyperlink>
     </w:p>
     <w:p>
       <w:pPr>
@@ -2824,7 +2869,7 @@
     </w:p>
     <w:p>
       <w:r>
-        <w:t>아래 저장소 링크를 자신의 생성형 AI에 전달하고 “START_HERE.md 순서대로 내 Notion에 교무수첩을 만들어줘”라고 요청합니다. 학교급, 학년도, 담당 반·교과, 필요한 기능과 생성할 상위 페이지를 확인합니다. 실제 생성에는 Notion 쓰기 연결 또는 실행 환경이 필요합니다.</w:t>
+        <w:t>웹 질문지의 5단계 답변을 마친 뒤 생성된 요청문을 복사해 AI에 전달합니다. AI가 Notion 쓰기 권한과 생성 위치를 확인하고 선택한 기능으로 수첩을 만듭니다. 직접 시작하려면 저장소 링크와 “START_HERE.md 순서대로 내 Notion에 교무수첩을 만들어줘”라는 요청을 전달해도 됩니다. Notion 쓰기 연결이나 실행 도구가 없으면 설정 준비까지만 가능합니다.</w:t>
       </w:r>
     </w:p>
     <w:p>
@@ -2833,12 +2878,24 @@
           <w:rPr>
             <w:color w:val="245A81"/>
           </w:rPr>
-          <w:t>공개 저장소와 최신 안내</w:t>
+          <w:t>웹 질문지</w:t>
         </w:r>
       </w:hyperlink>
-    </w:p>
-    <w:p>
-      <w:hyperlink r:id="rId11">
+      <w:r>
+        <w:t xml:space="preserve">  ·  </w:t>
+      </w:r>
+      <w:hyperlink r:id="rId13">
+        <w:r>
+          <w:rPr>
+            <w:color w:val="245A81"/>
+          </w:rPr>
+          <w:t>공개 저장소</w:t>
+        </w:r>
+      </w:hyperlink>
+      <w:r>
+        <w:t xml:space="preserve">  ·  </w:t>
+      </w:r>
+      <w:hyperlink r:id="rId14">
         <w:r>
           <w:rPr>
             <w:color w:val="245A81"/>
@@ -2849,7 +2906,7 @@
     </w:p>
     <w:p>
       <w:r>
-        <w:t>기능 기준  2026년 10월 1일 예시 수첩과 업데이트 목록 2026.10.1. 화면 위치와 메뉴 이름은 Notion 언어·보기 설정에 따라 조금 다를 수 있습니다.</w:t>
+        <w:t>기능 기준  2026년 10월 2일, 업데이트 목록 2026.10.1. 선택 기능의 설치 여부와 Notion 언어·보기 설정에 따라 화면 위치와 메뉴 이름은 다를 수 있습니다.</w:t>
       </w:r>
     </w:p>
     <w:p>

</xml_diff>

<commit_message>
Refresh community introduction and publish guide v1.4
</commit_message>
<xml_diff>
--- a/output/docx/교무수첩_사용안내서.docx
+++ b/output/docx/교무수첩_사용안내서.docx
@@ -20,7 +20,7 @@
     </w:p>
     <w:p>
       <w:r>
-        <w:t>2026년 10월 2일 기준  ·  문서 버전 1.3  ·  교사용</w:t>
+        <w:t>2026년 10월 6일 기준  ·  문서 버전 1.4  ·  교사용</w:t>
       </w:r>
     </w:p>
     <w:p>
@@ -38,7 +38,7 @@
     </w:p>
     <w:p>
       <w:r>
-        <w:t>5단계 질문지에서 학교·학년도·담당 수업과 필요한 기능을 선택합니다. 완성된 AI 요청문을 복사해 Notion에 페이지를 만들고 수정할 수 있는 AI에 전달하세요. 질문지는 브라우저 안에서 요청문을 만들며, 실제 수첩 생성은 연결된 AI가 진행합니다.</w:t>
+        <w:t>5단계 질문지에서 학교·학년도·담당 수업과 필요한 기능을 선택합니다. 배치 미리보기에서 화면을 꾸민 뒤 AI에게 적용을 요청할 수도 있습니다. 실제 수첩 생성·수정은 Notion 편집 도구가 연결된 AI가 진행합니다.</w:t>
       </w:r>
     </w:p>
     <w:p>
@@ -47,7 +47,7 @@
           <w:rPr>
             <w:color w:val="245A81"/>
           </w:rPr>
-          <w:t>웹 질문지 열기</w:t>
+          <w:t>웹 질문지</w:t>
         </w:r>
       </w:hyperlink>
       <w:r>
@@ -58,7 +58,7 @@
           <w:rPr>
             <w:color w:val="245A81"/>
           </w:rPr>
-          <w:t>HTML 안내서 읽기</w:t>
+          <w:t>배치 미리보기</w:t>
         </w:r>
       </w:hyperlink>
       <w:r>
@@ -69,7 +69,29 @@
           <w:rPr>
             <w:color w:val="245A81"/>
           </w:rPr>
-          <w:t>PDF 안내서 열기</w:t>
+          <w:t>수정 요청문</w:t>
+        </w:r>
+      </w:hyperlink>
+      <w:r>
+        <w:t xml:space="preserve">  ·  </w:t>
+      </w:r>
+      <w:hyperlink r:id="rId13">
+        <w:r>
+          <w:rPr>
+            <w:color w:val="245A81"/>
+          </w:rPr>
+          <w:t>HTML 안내서</w:t>
+        </w:r>
+      </w:hyperlink>
+      <w:r>
+        <w:t xml:space="preserve">  ·  </w:t>
+      </w:r>
+      <w:hyperlink r:id="rId14">
+        <w:r>
+          <w:rPr>
+            <w:color w:val="245A81"/>
+          </w:rPr>
+          <w:t>PDF 안내서</w:t>
         </w:r>
       </w:hyperlink>
     </w:p>
@@ -435,7 +457,9 @@
       <w:r>
         <w:t>빠른 찾기  2쪽 일과와 할 일  ·  3쪽 학생과 상담  ·  4쪽 시간표와 진도</w:t>
         <w:br/>
-        <w:t>5쪽 기록 양식  ·  6쪽 급식과 학사일정  ·  7쪽 주간 정리  ·  8쪽 문제 해결  ·  9쪽 기존 수첩 업데이트</w:t>
+        <w:t>5쪽 기록 양식  ·  6쪽 급식과 학사일정  ·  7쪽 주간 정리  ·  8쪽 문제 해결</w:t>
+        <w:br/>
+        <w:t>9쪽 기존 수첩 업데이트  ·  10쪽 배치 미리보기  ·  11쪽 수정 요청문</w:t>
       </w:r>
     </w:p>
     <w:p>
@@ -2884,7 +2908,7 @@
       <w:r>
         <w:t xml:space="preserve">  ·  </w:t>
       </w:r>
-      <w:hyperlink r:id="rId13">
+      <w:hyperlink r:id="rId15">
         <w:r>
           <w:rPr>
             <w:color w:val="245A81"/>
@@ -2895,7 +2919,7 @@
       <w:r>
         <w:t xml:space="preserve">  ·  </w:t>
       </w:r>
-      <w:hyperlink r:id="rId14">
+      <w:hyperlink r:id="rId16">
         <w:r>
           <w:rPr>
             <w:color w:val="245A81"/>
@@ -2906,7 +2930,7 @@
     </w:p>
     <w:p>
       <w:r>
-        <w:t>기능 기준  2026년 10월 2일, 업데이트 목록 2026.10.1. 선택 기능의 설치 여부와 Notion 언어·보기 설정에 따라 화면 위치와 메뉴 이름은 다를 수 있습니다.</w:t>
+        <w:t>기능 기준  2026년 10월 6일, 업데이트 목록 2026.10.1. 선택 기능의 설치 여부와 Notion 언어·보기 설정에 따라 화면 위치와 메뉴 이름은 다를 수 있습니다.</w:t>
       </w:r>
     </w:p>
     <w:p>
@@ -3363,6 +3387,644 @@
         <w:t>급식·학사일정의 매일 갱신은 별개입니다. 버전은 기능별로 관리하며, 적용 이력에는 위치와 단계만 저장합니다. 학생 이름·상담 본문은 넣지 않습니다.</w:t>
       </w:r>
     </w:p>
+    <w:p>
+      <w:pPr>
+        <w:pStyle w:val="Heading1"/>
+        <w:pageBreakBefore/>
+      </w:pPr>
+      <w:r>
+        <w:t>9  수첩 배치를 미리 보고 꾸미기</w:t>
+      </w:r>
+    </w:p>
+    <w:p>
+      <w:r>
+        <w:t>배치 미리보기에서는 홈·학급 경영·교과 진도·학사 캘린더 네 화면을 먼저 살펴보고 구역을 옮길 수 있습니다. 실제 학생 기록을 읽어 오지 않으며, 빈 표와 구역으로 구성과 위치를 보여 줍니다.</w:t>
+      </w:r>
+    </w:p>
+    <w:p>
+      <w:hyperlink r:id="rId11">
+        <w:r>
+          <w:rPr>
+            <w:color w:val="245A81"/>
+          </w:rPr>
+          <w:t>전체 배치 미리보기 열기</w:t>
+        </w:r>
+      </w:hyperlink>
+    </w:p>
+    <w:p>
+      <w:pPr>
+        <w:pStyle w:val="Heading2"/>
+      </w:pPr>
+      <w:r>
+        <w:t>구역을 끌어서 원하는 곳에 놓기</w:t>
+      </w:r>
+    </w:p>
+    <w:p>
+      <w:r>
+        <w:t>구역의 이동 손잡이를 끌면 놓일 자리가 반투명하게 표시됩니다. 행 사이에 놓으면 새 줄이 되고, 다른 구역의 위아래에 놓으면 같은 열에 쌓입니다. 좌우 가장자리에 놓으면 열을 나눌 수 있습니다. 드래그가 어렵다면 손잡이를 클릭해 기준 구역과 놓을 위치를 고르세요.</w:t>
+      </w:r>
+    </w:p>
+    <w:p>
+      <w:pPr>
+        <w:pStyle w:val="Heading2"/>
+      </w:pPr>
+      <w:r>
+        <w:t>행마다 열 수와 너비 바꾸기</w:t>
+      </w:r>
+    </w:p>
+    <w:tbl>
+      <w:tblPr>
+        <w:tblW w:type="auto" w:w="0"/>
+        <w:jc w:val="center"/>
+        <w:tblLayout w:type="fixed"/>
+        <w:tblLook w:firstColumn="1" w:firstRow="1" w:lastColumn="0" w:lastRow="0" w:noHBand="0" w:noVBand="1" w:val="04A0"/>
+        <w:tblBorders>
+          <w:top w:val="single" w:sz="4" w:color="D9D9D9"/>
+          <w:left w:val="single" w:sz="4" w:color="D9D9D9"/>
+          <w:bottom w:val="single" w:sz="4" w:color="D9D9D9"/>
+          <w:right w:val="single" w:sz="4" w:color="D9D9D9"/>
+          <w:insideH w:val="single" w:sz="4" w:color="D9D9D9"/>
+          <w:insideV w:val="single" w:sz="4" w:color="D9D9D9"/>
+        </w:tblBorders>
+      </w:tblPr>
+      <w:tblGrid>
+        <w:gridCol w:w="2376"/>
+        <w:gridCol w:w="7704"/>
+      </w:tblGrid>
+      <w:tr>
+        <w:trPr>
+          <w:cantSplit/>
+          <w:tblHeader/>
+        </w:trPr>
+        <w:tc>
+          <w:tcPr>
+            <w:tcW w:type="dxa" w:w="2376"/>
+            <w:vAlign w:val="center"/>
+            <w:tcMar>
+              <w:top w:w="105" w:type="dxa"/>
+              <w:left w:w="105" w:type="dxa"/>
+              <w:bottom w:w="105" w:type="dxa"/>
+              <w:right w:w="105" w:type="dxa"/>
+            </w:tcMar>
+            <w:shd w:fill="E9EEF2"/>
+          </w:tcPr>
+          <w:p>
+            <w:pPr>
+              <w:keepNext w:val="0"/>
+              <w:spacing w:after="0" w:line="290" w:lineRule="exact"/>
+            </w:pPr>
+            <w:r>
+              <w:rPr>
+                <w:b/>
+                <w:sz w:val="21"/>
+              </w:rPr>
+              <w:t>하고 싶은 일</w:t>
+            </w:r>
+          </w:p>
+        </w:tc>
+        <w:tc>
+          <w:tcPr>
+            <w:tcW w:type="dxa" w:w="7704"/>
+            <w:vAlign w:val="center"/>
+            <w:tcMar>
+              <w:top w:w="105" w:type="dxa"/>
+              <w:left w:w="105" w:type="dxa"/>
+              <w:bottom w:w="105" w:type="dxa"/>
+              <w:right w:w="105" w:type="dxa"/>
+            </w:tcMar>
+            <w:shd w:fill="E9EEF2"/>
+          </w:tcPr>
+          <w:p>
+            <w:pPr>
+              <w:spacing w:after="0" w:line="290" w:lineRule="exact"/>
+            </w:pPr>
+            <w:r>
+              <w:rPr>
+                <w:b/>
+                <w:sz w:val="21"/>
+              </w:rPr>
+              <w:t>행의 열 편집에서 할 일</w:t>
+            </w:r>
+          </w:p>
+        </w:tc>
+      </w:tr>
+      <w:tr>
+        <w:trPr>
+          <w:cantSplit/>
+        </w:trPr>
+        <w:tc>
+          <w:tcPr>
+            <w:tcW w:type="dxa" w:w="2376"/>
+            <w:vAlign w:val="center"/>
+            <w:tcMar>
+              <w:top w:w="105" w:type="dxa"/>
+              <w:left w:w="105" w:type="dxa"/>
+              <w:bottom w:w="105" w:type="dxa"/>
+              <w:right w:w="105" w:type="dxa"/>
+            </w:tcMar>
+          </w:tcPr>
+          <w:p>
+            <w:pPr>
+              <w:keepNext w:val="0"/>
+              <w:spacing w:after="0" w:line="290" w:lineRule="exact"/>
+            </w:pPr>
+            <w:r>
+              <w:rPr>
+                <w:b w:val="0"/>
+                <w:sz w:val="21"/>
+              </w:rPr>
+              <w:t>2·3·4열로 나누기</w:t>
+            </w:r>
+          </w:p>
+        </w:tc>
+        <w:tc>
+          <w:tcPr>
+            <w:tcW w:type="dxa" w:w="7704"/>
+            <w:vAlign w:val="center"/>
+            <w:tcMar>
+              <w:top w:w="105" w:type="dxa"/>
+              <w:left w:w="105" w:type="dxa"/>
+              <w:bottom w:w="105" w:type="dxa"/>
+              <w:right w:w="105" w:type="dxa"/>
+            </w:tcMar>
+          </w:tcPr>
+          <w:p>
+            <w:pPr>
+              <w:spacing w:after="0" w:line="290" w:lineRule="exact"/>
+            </w:pPr>
+            <w:r>
+              <w:rPr>
+                <w:b w:val="0"/>
+                <w:sz w:val="21"/>
+              </w:rPr>
+              <w:t>그 행의 구역을 선택한 열 수로 나눕니다. 열마다 들어갈 구역이 필요합니다.</w:t>
+            </w:r>
+          </w:p>
+        </w:tc>
+      </w:tr>
+      <w:tr>
+        <w:trPr>
+          <w:cantSplit/>
+        </w:trPr>
+        <w:tc>
+          <w:tcPr>
+            <w:tcW w:type="dxa" w:w="2376"/>
+            <w:vAlign w:val="center"/>
+            <w:tcMar>
+              <w:top w:w="105" w:type="dxa"/>
+              <w:left w:w="105" w:type="dxa"/>
+              <w:bottom w:w="105" w:type="dxa"/>
+              <w:right w:w="105" w:type="dxa"/>
+            </w:tcMar>
+          </w:tcPr>
+          <w:p>
+            <w:pPr>
+              <w:keepNext w:val="0"/>
+              <w:spacing w:after="0" w:line="290" w:lineRule="exact"/>
+            </w:pPr>
+            <w:r>
+              <w:rPr>
+                <w:b w:val="0"/>
+                <w:sz w:val="21"/>
+              </w:rPr>
+              <w:t>다른 구역을 새 열로</w:t>
+            </w:r>
+          </w:p>
+        </w:tc>
+        <w:tc>
+          <w:tcPr>
+            <w:tcW w:type="dxa" w:w="7704"/>
+            <w:vAlign w:val="center"/>
+            <w:tcMar>
+              <w:top w:w="105" w:type="dxa"/>
+              <w:left w:w="105" w:type="dxa"/>
+              <w:bottom w:w="105" w:type="dxa"/>
+              <w:right w:w="105" w:type="dxa"/>
+            </w:tcMar>
+          </w:tcPr>
+          <w:p>
+            <w:pPr>
+              <w:spacing w:after="0" w:line="290" w:lineRule="exact"/>
+            </w:pPr>
+            <w:r>
+              <w:rPr>
+                <w:b w:val="0"/>
+                <w:sz w:val="21"/>
+              </w:rPr>
+              <w:t>같은 페이지의 구역을 골라 ‘열 추가’를 누릅니다. 한 행은 최대 네 열입니다.</w:t>
+            </w:r>
+          </w:p>
+        </w:tc>
+      </w:tr>
+      <w:tr>
+        <w:trPr>
+          <w:cantSplit/>
+        </w:trPr>
+        <w:tc>
+          <w:tcPr>
+            <w:tcW w:type="dxa" w:w="2376"/>
+            <w:vAlign w:val="center"/>
+            <w:tcMar>
+              <w:top w:w="105" w:type="dxa"/>
+              <w:left w:w="105" w:type="dxa"/>
+              <w:bottom w:w="105" w:type="dxa"/>
+              <w:right w:w="105" w:type="dxa"/>
+            </w:tcMar>
+          </w:tcPr>
+          <w:p>
+            <w:pPr>
+              <w:keepNext w:val="0"/>
+              <w:spacing w:after="0" w:line="290" w:lineRule="exact"/>
+            </w:pPr>
+            <w:r>
+              <w:rPr>
+                <w:b w:val="0"/>
+                <w:sz w:val="21"/>
+              </w:rPr>
+              <w:t>한 열로 합치기</w:t>
+            </w:r>
+          </w:p>
+        </w:tc>
+        <w:tc>
+          <w:tcPr>
+            <w:tcW w:type="dxa" w:w="7704"/>
+            <w:vAlign w:val="center"/>
+            <w:tcMar>
+              <w:top w:w="105" w:type="dxa"/>
+              <w:left w:w="105" w:type="dxa"/>
+              <w:bottom w:w="105" w:type="dxa"/>
+              <w:right w:w="105" w:type="dxa"/>
+            </w:tcMar>
+          </w:tcPr>
+          <w:p>
+            <w:pPr>
+              <w:spacing w:after="0" w:line="290" w:lineRule="exact"/>
+            </w:pPr>
+            <w:r>
+              <w:rPr>
+                <w:b w:val="0"/>
+                <w:sz w:val="21"/>
+              </w:rPr>
+              <w:t>‘1열로 합치기’로 기존 구역을 순서대로 쌓습니다.</w:t>
+            </w:r>
+          </w:p>
+        </w:tc>
+      </w:tr>
+      <w:tr>
+        <w:trPr>
+          <w:cantSplit/>
+        </w:trPr>
+        <w:tc>
+          <w:tcPr>
+            <w:tcW w:type="dxa" w:w="2376"/>
+            <w:vAlign w:val="center"/>
+            <w:tcMar>
+              <w:top w:w="105" w:type="dxa"/>
+              <w:left w:w="105" w:type="dxa"/>
+              <w:bottom w:w="105" w:type="dxa"/>
+              <w:right w:w="105" w:type="dxa"/>
+            </w:tcMar>
+          </w:tcPr>
+          <w:p>
+            <w:pPr>
+              <w:keepNext w:val="0"/>
+              <w:spacing w:after="0" w:line="290" w:lineRule="exact"/>
+            </w:pPr>
+            <w:r>
+              <w:rPr>
+                <w:b w:val="0"/>
+                <w:sz w:val="21"/>
+              </w:rPr>
+              <w:t>너비 조절하기</w:t>
+            </w:r>
+          </w:p>
+        </w:tc>
+        <w:tc>
+          <w:tcPr>
+            <w:tcW w:type="dxa" w:w="7704"/>
+            <w:vAlign w:val="center"/>
+            <w:tcMar>
+              <w:top w:w="105" w:type="dxa"/>
+              <w:left w:w="105" w:type="dxa"/>
+              <w:bottom w:w="105" w:type="dxa"/>
+              <w:right w:w="105" w:type="dxa"/>
+            </w:tcMar>
+          </w:tcPr>
+          <w:p>
+            <w:pPr>
+              <w:spacing w:after="0" w:line="290" w:lineRule="exact"/>
+            </w:pPr>
+            <w:r>
+              <w:rPr>
+                <w:b w:val="0"/>
+                <w:sz w:val="21"/>
+              </w:rPr>
+              <w:t>열별 %를 입력하거나 ‘너비 같게’를 누릅니다. 각 열은 최소 10%입니다.</w:t>
+            </w:r>
+          </w:p>
+        </w:tc>
+      </w:tr>
+      <w:tr>
+        <w:trPr>
+          <w:cantSplit/>
+        </w:trPr>
+        <w:tc>
+          <w:tcPr>
+            <w:tcW w:type="dxa" w:w="2376"/>
+            <w:vAlign w:val="center"/>
+            <w:tcMar>
+              <w:top w:w="105" w:type="dxa"/>
+              <w:left w:w="105" w:type="dxa"/>
+              <w:bottom w:w="105" w:type="dxa"/>
+              <w:right w:w="105" w:type="dxa"/>
+            </w:tcMar>
+          </w:tcPr>
+          <w:p>
+            <w:pPr>
+              <w:keepNext w:val="0"/>
+              <w:spacing w:after="0" w:line="290" w:lineRule="exact"/>
+            </w:pPr>
+            <w:r>
+              <w:rPr>
+                <w:b w:val="0"/>
+                <w:sz w:val="21"/>
+              </w:rPr>
+              <w:t>편집 되돌리기</w:t>
+            </w:r>
+          </w:p>
+        </w:tc>
+        <w:tc>
+          <w:tcPr>
+            <w:tcW w:type="dxa" w:w="7704"/>
+            <w:vAlign w:val="center"/>
+            <w:tcMar>
+              <w:top w:w="105" w:type="dxa"/>
+              <w:left w:w="105" w:type="dxa"/>
+              <w:bottom w:w="105" w:type="dxa"/>
+              <w:right w:w="105" w:type="dxa"/>
+            </w:tcMar>
+          </w:tcPr>
+          <w:p>
+            <w:pPr>
+              <w:spacing w:after="0" w:line="290" w:lineRule="exact"/>
+            </w:pPr>
+            <w:r>
+              <w:rPr>
+                <w:b w:val="0"/>
+                <w:sz w:val="21"/>
+              </w:rPr>
+              <w:t>‘되돌리기’로 직전 편집을 취소하거나 ‘이 화면 기본 배치’로 복원합니다.</w:t>
+            </w:r>
+          </w:p>
+        </w:tc>
+      </w:tr>
+    </w:tbl>
+    <w:p>
+      <w:pPr>
+        <w:spacing w:after="0"/>
+      </w:pPr>
+    </w:p>
+    <w:p>
+      <w:pPr>
+        <w:pStyle w:val="Heading2"/>
+      </w:pPr>
+      <w:r>
+        <w:t>확인한 배치를 AI에게 전달하기</w:t>
+      </w:r>
+    </w:p>
+    <w:p>
+      <w:r>
+        <w:rPr>
+          <w:b/>
+        </w:rPr>
+        <w:t xml:space="preserve">1. 선택하고 살펴보기  </w:t>
+      </w:r>
+      <w:r>
+        <w:t>사용할 기능을 고르고 네 화면을 모두 확인합니다. 배치를 바꾼 뒤에는 다시 확인합니다.</w:t>
+      </w:r>
+    </w:p>
+    <w:p>
+      <w:r>
+        <w:rPr>
+          <w:b/>
+        </w:rPr>
+        <w:t xml:space="preserve">2. 파일과 요청문 받기  </w:t>
+      </w:r>
+      <w:r>
+        <w:t>확인 항목을 체크하고 ‘배치 파일 저장’과 ‘AI 요청문 복사’를 사용합니다.</w:t>
+      </w:r>
+    </w:p>
+    <w:p>
+      <w:r>
+        <w:rPr>
+          <w:b/>
+        </w:rPr>
+        <w:t xml:space="preserve">3. 같은 대화에 전달하기  </w:t>
+      </w:r>
+      <w:r>
+        <w:t>Notion 편집 도구가 연결된 AI에 요청문을 붙이고 reviewed-layout.json 파일을 첨부합니다. 새 설치라면 학교·수업 정보가 담긴 설치 요청문도 전달합니다.</w:t>
+      </w:r>
+    </w:p>
+    <w:p>
+      <w:r>
+        <w:rPr>
+          <w:b/>
+        </w:rPr>
+        <w:t xml:space="preserve">4. 실제 화면 확인하기  </w:t>
+      </w:r>
+      <w:r>
+        <w:t>AI가 같은 배치로 적용하고 실제 네 화면을 대조하도록 요청합니다. ‘네 화면을 HTML로 보관’은 나중에 다시 볼 파일을 저장하는 기능입니다.</w:t>
+      </w:r>
+    </w:p>
+    <w:p>
+      <w:r>
+        <w:t>기본값은 전체 너비 켜기·작은 텍스트 끄기입니다. 확인한 순서·열 비율·접기 구조를 적용 기준으로 쓰며, 글꼴·간격은 실제 Notion에서 달라질 수 있습니다. 웹에서 편집하거나 HTML을 저장한 것만으로 Notion이 바뀌지는 않습니다.</w:t>
+      </w:r>
+    </w:p>
+    <w:p>
+      <w:pPr>
+        <w:pStyle w:val="Heading1"/>
+        <w:pageBreakBefore/>
+      </w:pPr>
+      <w:r>
+        <w:t>10  기존 수첩을 AI와 함께 수정하기</w:t>
+      </w:r>
+    </w:p>
+    <w:p>
+      <w:r>
+        <w:t>사용하다 필요한 기능이 생기면 수첩을 새로 만들지 않고 기존 페이지의 변경을 요청할 수 있습니다. 수정 요청문 화면에서 원하는 결과를 고르면 AI에게 전달할 문장을 준비해 줍니다.</w:t>
+      </w:r>
+    </w:p>
+    <w:p>
+      <w:hyperlink r:id="rId12">
+        <w:r>
+          <w:rPr>
+            <w:color w:val="245A81"/>
+          </w:rPr>
+          <w:t>내 수첩 수정 요청문 만들기</w:t>
+        </w:r>
+      </w:hyperlink>
+    </w:p>
+    <w:p>
+      <w:pPr>
+        <w:pStyle w:val="Heading2"/>
+      </w:pPr>
+      <w:r>
+        <w:t>원하는 기능을 고르고 요청하기</w:t>
+      </w:r>
+    </w:p>
+    <w:p>
+      <w:r>
+        <w:rPr>
+          <w:b/>
+        </w:rPr>
+        <w:t xml:space="preserve">1. 수정할 화면 알려주기  </w:t>
+      </w:r>
+      <w:r>
+        <w:t>기존 Notion 수첩의 페이지 링크와 원하는 변경을 적습니다. 새 설치 질문에 다시 답할 필요는 없습니다.</w:t>
+      </w:r>
+    </w:p>
+    <w:p>
+      <w:r>
+        <w:rPr>
+          <w:b/>
+        </w:rPr>
+        <w:t xml:space="preserve">2. 필요한 결과 선택하기  </w:t>
+      </w:r>
+      <w:r>
+        <w:t>학생 상담 이력, 미제출자 보기, 이번 주 할 일, 회의 후속 업무, 기록 양식, 수업 진도, 홈 보기와 배치 중에서 고릅니다. 다른 기능은 직접 설명합니다.</w:t>
+      </w:r>
+    </w:p>
+    <w:p>
+      <w:r>
+        <w:rPr>
+          <w:b/>
+        </w:rPr>
+        <w:t xml:space="preserve">3. 요청문을 읽고 전달하기  </w:t>
+      </w:r>
+      <w:r>
+        <w:t>내용을 확인한 뒤 복사하거나 TXT로 저장해 Notion 편집 도구가 연결된 AI에 전달합니다. 학생 이름·상담 본문·API 키 대신 필요한 기능을 설명하세요.</w:t>
+      </w:r>
+    </w:p>
+    <w:p>
+      <w:r>
+        <w:rPr>
+          <w:b/>
+        </w:rPr>
+        <w:t xml:space="preserve">4. 기존 기록과 결과 확인하기  </w:t>
+      </w:r>
+      <w:r>
+        <w:t>AI가 현재 수첩을 읽고 필요한 부분을 바꾼 뒤 확인하도록 요청합니다. 이미 작성한 기록과 직접 꾸민 다른 부분은 유지합니다.</w:t>
+      </w:r>
+    </w:p>
+    <w:p>
+      <w:pPr>
+        <w:pStyle w:val="Heading2"/>
+      </w:pPr>
+      <w:r>
+        <w:t>이렇게 요청할 수 있어요</w:t>
+      </w:r>
+    </w:p>
+    <w:p>
+      <w:pPr>
+        <w:pStyle w:val="ListBullet"/>
+      </w:pPr>
+      <w:r>
+        <w:t>“상담 기록 양식에 다음 상담에서 확인할 질문을 추가해줘. 이미 작성한 상담 내용은 유지해줘.”</w:t>
+      </w:r>
+    </w:p>
+    <w:p>
+      <w:pPr>
+        <w:pStyle w:val="ListBullet"/>
+      </w:pPr>
+      <w:r>
+        <w:t>“이번 주에 마감되는 미완료 업무를 홈에서 보고 싶어. 기존 업무 원본을 사용하는 보기로 추가해줘.”</w:t>
+      </w:r>
+    </w:p>
+    <w:p>
+      <w:pPr>
+        <w:pStyle w:val="ListBullet"/>
+      </w:pPr>
+      <w:r>
+        <w:t>“미리보기에서 확인한 배치 파일대로 구역을 옮겨줘. 학생·상담 기록과 시간표·중식 연결은 유지해줘.”</w:t>
+      </w:r>
+    </w:p>
+    <w:p>
+      <w:pPr>
+        <w:pStyle w:val="Heading2"/>
+      </w:pPr>
+      <w:r>
+        <w:t>꾸준히 바꾸면서 사용할 때</w:t>
+      </w:r>
+    </w:p>
+    <w:p>
+      <w:r>
+        <w:t>수정 요청문은 본인의 수첩을 바꾸는 요청입니다. 공개 템플릿에도 같은 개선을 넣고 싶다면 그 범위를 따로 알려 주세요. 공통 템플릿이 바뀌어도 이미 만든 다른 교사의 수첩이 자동으로 바뀌지는 않습니다.</w:t>
+      </w:r>
+    </w:p>
+    <w:p>
+      <w:r>
+        <w:t>전체 배치를 바꿀 때는 앞쪽의 미리보기 절차를 사용합니다. 이동 링크는 맨 위에, 빠른 실행·PARA 등 카드 묶음은 내부 구성을 유지합니다. 주간·월간 캘린더는 같은 일정 원본을, 홈과 교과 페이지는 같은 주간 시간표를 계속 사용합니다.</w:t>
+      </w:r>
+    </w:p>
+    <w:p>
+      <w:r>
+        <w:t>웹은 요청문을 만드는 도구입니다. 실제 수정에는 AI의 Notion 접근·편집 권한이 필요합니다. 적용을 마친 뒤에는 바뀐 페이지 링크와 확인 결과, 아직 마무리하지 못한 부분을 함께 받으세요.</w:t>
+      </w:r>
+    </w:p>
+    <w:p>
+      <w:pPr>
+        <w:pStyle w:val="Heading2"/>
+      </w:pPr>
+      <w:r>
+        <w:t>웹과 안내서 바로가기</w:t>
+      </w:r>
+    </w:p>
+    <w:p>
+      <w:hyperlink r:id="rId15">
+        <w:r>
+          <w:rPr>
+            <w:color w:val="245A81"/>
+          </w:rPr>
+          <w:t>공개 GitHub 저장소</w:t>
+        </w:r>
+      </w:hyperlink>
+      <w:r>
+        <w:t xml:space="preserve">  ·  </w:t>
+      </w:r>
+      <w:hyperlink r:id="rId13">
+        <w:r>
+          <w:rPr>
+            <w:color w:val="245A81"/>
+          </w:rPr>
+          <w:t>HTML 안내서</w:t>
+        </w:r>
+      </w:hyperlink>
+      <w:r>
+        <w:t xml:space="preserve">  ·  </w:t>
+      </w:r>
+      <w:hyperlink r:id="rId14">
+        <w:r>
+          <w:rPr>
+            <w:color w:val="245A81"/>
+          </w:rPr>
+          <w:t>PDF 안내서</w:t>
+        </w:r>
+      </w:hyperlink>
+    </w:p>
+    <w:p>
+      <w:r>
+        <w:t xml:space="preserve">made by 여광재(온양고)  ·  made with </w:t>
+      </w:r>
+      <w:hyperlink r:id="rId17">
+        <w:r>
+          <w:rPr>
+            <w:color w:val="245A81"/>
+          </w:rPr>
+          <w:t>DoRms</w:t>
+        </w:r>
+      </w:hyperlink>
+    </w:p>
     <w:sectPr>
       <w:footerReference w:type="default" r:id="rId9"/>
       <w:pgSz w:w="12240" w:h="15840"/>

</xml_diff>